<commit_message>
Fix descriptive statistics: corrected ordinal mappings and N=125
- Fixed Q11 map: added 'Moderately aware' as level 4 (was missing, causing N=62)
- Fixed Q11 map: corrected scale to Not at all/Slightly/Somewhat/Moderately/Extremely
- Fixed Q18 map: updated to match actual data values (Fairly/Mosty confident)
- Confirmed true N=125 (Sheet1 row 0 is question text, not a response)
</commit_message>
<xml_diff>
--- a/Dr. Lauren Azevedo - AI/Descriptives_Tables.docx
+++ b/Dr. Lauren Azevedo - AI/Descriptives_Tables.docx
@@ -25,7 +25,7 @@
           <w:rFonts w:ascii="Arial" w:hAnsi="Arial"/>
           <w:b/>
           <w:color w:val="1F4E79"/>
-          <w:sz w:val="32"/>
+          <w:sz w:val="28"/>
         </w:rPr>
         <w:t>AI Use in Community Foundations Study</w:t>
       </w:r>
@@ -38,7 +38,7 @@
         <w:rPr>
           <w:rFonts w:ascii="Arial" w:hAnsi="Arial"/>
           <w:i/>
-          <w:sz w:val="24"/>
+          <w:sz w:val="22"/>
         </w:rPr>
         <w:t>Azevedo &amp; Shi (2025)</w:t>
       </w:r>
@@ -50,7 +50,7 @@
           <w:rFonts w:ascii="Arial" w:hAnsi="Arial"/>
           <w:b/>
           <w:color w:val="1F4E79"/>
-          <w:sz w:val="26"/>
+          <w:sz w:val="24"/>
         </w:rPr>
         <w:t>Table 1. Internal Culture and Governance (Q9)</w:t>
       </w:r>
@@ -1264,7 +1264,7 @@
           <w:i/>
           <w:sz w:val="18"/>
         </w:rPr>
-        <w:t>Note. Items rated on a 7-point Likert scale (1 = Strongly Disagree, 7 = Strongly Agree). N reflects responses after mode substitution.</w:t>
+        <w:t>Note. Items rated on a 7-point Likert scale (1 = Strongly Disagree, 7 = Strongly Agree). N = 125.</w:t>
       </w:r>
     </w:p>
     <w:p/>
@@ -1274,7 +1274,7 @@
           <w:rFonts w:ascii="Arial" w:hAnsi="Arial"/>
           <w:b/>
           <w:color w:val="1F4E79"/>
-          <w:sz w:val="26"/>
+          <w:sz w:val="24"/>
         </w:rPr>
         <w:t>Table 2. Equity and AI Values (Q19)</w:t>
       </w:r>
@@ -2926,7 +2926,7 @@
           <w:i/>
           <w:sz w:val="18"/>
         </w:rPr>
-        <w:t>Note. Items rated on a 7-point Likert scale (1 = Strongly Disagree, 7 = Strongly Agree). N reflects responses after mode substitution.</w:t>
+        <w:t>Note. Items rated on a 7-point Likert scale (1 = Strongly Disagree, 7 = Strongly Agree). N = 125 after mode substitution for missing values.</w:t>
       </w:r>
     </w:p>
     <w:p/>
@@ -2936,7 +2936,7 @@
           <w:rFonts w:ascii="Arial" w:hAnsi="Arial"/>
           <w:b/>
           <w:color w:val="1F4E79"/>
-          <w:sz w:val="26"/>
+          <w:sz w:val="24"/>
         </w:rPr>
         <w:t>Table 3. AI Awareness and Use</w:t>
       </w:r>
@@ -3153,7 +3153,7 @@
                 <w:rFonts w:ascii="Arial" w:hAnsi="Arial"/>
                 <w:sz w:val="20"/>
               </w:rPr>
-              <w:t>101</w:t>
+              <w:t>125</w:t>
             </w:r>
           </w:p>
         </w:tc>
@@ -3171,7 +3171,7 @@
                 <w:rFonts w:ascii="Arial" w:hAnsi="Arial"/>
                 <w:sz w:val="20"/>
               </w:rPr>
-              <w:t>3.29</w:t>
+              <w:t>3.74</w:t>
             </w:r>
           </w:p>
         </w:tc>
@@ -3189,7 +3189,7 @@
                 <w:rFonts w:ascii="Arial" w:hAnsi="Arial"/>
                 <w:sz w:val="20"/>
               </w:rPr>
-              <w:t>3.00</w:t>
+              <w:t>4.00</w:t>
             </w:r>
           </w:p>
         </w:tc>
@@ -3207,7 +3207,7 @@
                 <w:rFonts w:ascii="Arial" w:hAnsi="Arial"/>
                 <w:sz w:val="20"/>
               </w:rPr>
-              <w:t>3.00</w:t>
+              <w:t>4.00</w:t>
             </w:r>
           </w:p>
         </w:tc>
@@ -3225,7 +3225,7 @@
                 <w:rFonts w:ascii="Arial" w:hAnsi="Arial"/>
                 <w:sz w:val="20"/>
               </w:rPr>
-              <w:t>1.02</w:t>
+              <w:t>0.93</w:t>
             </w:r>
           </w:p>
         </w:tc>
@@ -3243,7 +3243,7 @@
                 <w:rFonts w:ascii="Arial" w:hAnsi="Arial"/>
                 <w:sz w:val="20"/>
               </w:rPr>
-              <w:t>0.59</w:t>
+              <w:t>-0.70</w:t>
             </w:r>
           </w:p>
         </w:tc>
@@ -3261,7 +3261,7 @@
                 <w:rFonts w:ascii="Arial" w:hAnsi="Arial"/>
                 <w:sz w:val="20"/>
               </w:rPr>
-              <w:t>-0.34</w:t>
+              <w:t>0.16</w:t>
             </w:r>
           </w:p>
         </w:tc>
@@ -3299,7 +3299,7 @@
                 <w:rFonts w:ascii="Arial" w:hAnsi="Arial"/>
                 <w:sz w:val="20"/>
               </w:rPr>
-              <w:t>84</w:t>
+              <w:t>125</w:t>
             </w:r>
           </w:p>
         </w:tc>
@@ -3317,7 +3317,7 @@
                 <w:rFonts w:ascii="Arial" w:hAnsi="Arial"/>
                 <w:sz w:val="20"/>
               </w:rPr>
-              <w:t>1.70</w:t>
+              <w:t>2.23</w:t>
             </w:r>
           </w:p>
         </w:tc>
@@ -3371,7 +3371,7 @@
                 <w:rFonts w:ascii="Arial" w:hAnsi="Arial"/>
                 <w:sz w:val="20"/>
               </w:rPr>
-              <w:t>0.46</w:t>
+              <w:t>0.89</w:t>
             </w:r>
           </w:p>
         </w:tc>
@@ -3389,7 +3389,7 @@
                 <w:rFonts w:ascii="Arial" w:hAnsi="Arial"/>
                 <w:sz w:val="20"/>
               </w:rPr>
-              <w:t>-0.89</w:t>
+              <w:t>0.43</w:t>
             </w:r>
           </w:p>
         </w:tc>
@@ -3407,7 +3407,7 @@
                 <w:rFonts w:ascii="Arial" w:hAnsi="Arial"/>
                 <w:sz w:val="20"/>
               </w:rPr>
-              <w:t>-1.22</w:t>
+              <w:t>-0.48</w:t>
             </w:r>
           </w:p>
         </w:tc>
@@ -3712,7 +3712,7 @@
           <w:i/>
           <w:sz w:val="18"/>
         </w:rPr>
-        <w:t>Note. Q11: AI awareness (1 = Not at all aware, 5 = Extremely aware). Q18: Confidence in AI accuracy (1 = Not at all, 4 = Mostly confident). Q20: Future AI integration plans (1 = No, 4 = Yes, to a great extent). Q32: Personal AI use (1 = No use, 5 = Advanced use).</w:t>
+        <w:t>Note. Q11: AI awareness (1 = Not at all, 2 = Slightly, 3 = Somewhat, 4 = Moderately, 5 = Extremely). Q18: Confidence in AI accuracy (1 = Not at all, 2 = Slightly, 3 = Fairly, 4 = Mosty confident). Q20: Future AI plans (1 = No, 4 = Yes, to a great extent). Q32: Personal AI use (1 = No use, 5 = Advanced use).</w:t>
       </w:r>
     </w:p>
     <w:p/>
@@ -3722,7 +3722,7 @@
           <w:rFonts w:ascii="Arial" w:hAnsi="Arial"/>
           <w:b/>
           <w:color w:val="1F4E79"/>
-          <w:sz w:val="26"/>
+          <w:sz w:val="24"/>
         </w:rPr>
         <w:t>Table 4. Equity Practices</w:t>
       </w:r>
@@ -4216,7 +4216,7 @@
           <w:rFonts w:ascii="Arial" w:hAnsi="Arial"/>
           <w:b/>
           <w:color w:val="1F4E79"/>
-          <w:sz w:val="26"/>
+          <w:sz w:val="24"/>
         </w:rPr>
         <w:t>Table 5. Foundation Characteristics</w:t>
       </w:r>
@@ -4700,7 +4700,7 @@
           <w:i/>
           <w:sz w:val="18"/>
         </w:rPr>
-        <w:t>Note. Q4: Asset value coded 1–5 ($&lt;1M to &gt;$100M). Q5: Staff size coded 1–3 (Small, Medium, Large).</w:t>
+        <w:t>Note. Q4: Asset value coded 1–5 (&lt;$1M to &gt;$100M). Q5: Staff size coded 1–3 (Small/Medium/Large).</w:t>
       </w:r>
     </w:p>
     <w:p/>
@@ -5077,10 +5077,6 @@
     <w:name w:val="Normal"/>
     <w:qFormat/>
     <w:rsid w:val="00FC693F"/>
-    <w:rPr>
-      <w:rFonts w:ascii="Arial" w:hAnsi="Arial"/>
-      <w:sz w:val="22"/>
-    </w:rPr>
   </w:style>
   <w:style w:type="paragraph" w:styleId="Header">
     <w:name w:val="header"/>

</xml_diff>

<commit_message>
Add Overview sheet, yellow highlights for mode-substituted cells, sheet descriptions
</commit_message>
<xml_diff>
--- a/Dr. Lauren Azevedo - AI/Descriptives_Tables.docx
+++ b/Dr. Lauren Azevedo - AI/Descriptives_Tables.docx
@@ -2926,7 +2926,7 @@
           <w:i/>
           <w:sz w:val="18"/>
         </w:rPr>
-        <w:t>Note. Items rated on a 7-point Likert scale (1 = Strongly Disagree, 7 = Strongly Agree). N = 125 after mode substitution for missing values.</w:t>
+        <w:t>Note. Items rated on a 7-point Likert scale (1 = Strongly Disagree, 7 = Strongly Agree). N = 125 after mode substitution.</w:t>
       </w:r>
     </w:p>
     <w:p/>
@@ -3712,7 +3712,7 @@
           <w:i/>
           <w:sz w:val="18"/>
         </w:rPr>
-        <w:t>Note. Q11: AI awareness (1 = Not at all, 2 = Slightly, 3 = Somewhat, 4 = Moderately, 5 = Extremely). Q18: Confidence in AI accuracy (1 = Not at all, 2 = Slightly, 3 = Fairly, 4 = Mosty confident). Q20: Future AI plans (1 = No, 4 = Yes, to a great extent). Q32: Personal AI use (1 = No use, 5 = Advanced use).</w:t>
+        <w:t>Note. Q11: AI awareness (1=Not at all, 2=Slightly, 3=Somewhat, 4=Moderately, 5=Extremely). Q18: Confidence in AI accuracy (1=Not at all, 2=Slightly, 3=Fairly, 4=Mosty confident). Q20: Future AI plans (1=No, 4=Yes to a great extent). Q32: Personal AI use (1=No use, 5=Advanced).</w:t>
       </w:r>
     </w:p>
     <w:p/>
@@ -4206,7 +4206,7 @@
           <w:i/>
           <w:sz w:val="18"/>
         </w:rPr>
-        <w:t>Note. Q23: Importance of equity (1 = Not at all important, 4 = Extremely important). Q25: Community involvement in grant-making (1 = Not at all, 4 = To a great extent).</w:t>
+        <w:t>Note. Q23: Importance of equity (1=Not at all important, 4=Extremely important). Q25: Community involvement in grant-making (1=Not at all, 4=To a great extent).</w:t>
       </w:r>
     </w:p>
     <w:p/>

</xml_diff>

<commit_message>
Add exploratory factor analysis (EFA) on AI scale variables (Q19)
- New sheet '5_FactorAnalysis' in AIuse_Decisions_Analyzed.xlsx
- New Table 6 in Descriptives_Tables.docx
- 2-factor solution (parallel analysis): AI Implementation (α=.731) and Equity & Community (α=.651)
</commit_message>
<xml_diff>
--- a/Dr. Lauren Azevedo - AI/Descriptives_Tables.docx
+++ b/Dr. Lauren Azevedo - AI/Descriptives_Tables.docx
@@ -4704,6 +4704,1018 @@
       </w:r>
     </w:p>
     <w:p/>
+    <w:p>
+      <w:r>
+        <w:rPr>
+          <w:rFonts w:ascii="Arial" w:hAnsi="Arial"/>
+          <w:b/>
+          <w:color w:val="1F4E79"/>
+          <w:sz w:val="24"/>
+        </w:rPr>
+        <w:t>Table 6. Exploratory Factor Analysis of AI Scale Variables (Q19)</w:t>
+      </w:r>
+    </w:p>
+    <w:tbl>
+      <w:tblPr>
+        <w:tblStyle w:val="TableGrid"/>
+        <w:tblW w:type="auto" w:w="0"/>
+        <w:tblLayout w:type="fixed"/>
+        <w:tblLook w:firstColumn="1" w:firstRow="1" w:lastColumn="0" w:lastRow="0" w:noHBand="0" w:noVBand="1" w:val="04A0"/>
+      </w:tblPr>
+      <w:tblGrid>
+        <w:gridCol w:w="3600"/>
+        <w:gridCol w:w="2160"/>
+        <w:gridCol w:w="2160"/>
+        <w:gridCol w:w="1440"/>
+      </w:tblGrid>
+      <w:tr>
+        <w:tc>
+          <w:tcPr>
+            <w:shd w:val="clear" w:color="auto" w:fill="D5E8F0"/>
+          </w:tcPr>
+          <w:p>
+            <w:pPr/>
+            <w:r>
+              <w:rPr>
+                <w:rFonts w:ascii="Arial" w:hAnsi="Arial"/>
+                <w:sz w:val="20"/>
+                <w:b/>
+              </w:rPr>
+              <w:t>Variable</w:t>
+            </w:r>
+          </w:p>
+        </w:tc>
+        <w:tc>
+          <w:tcPr>
+            <w:shd w:val="clear" w:color="auto" w:fill="D5E8F0"/>
+          </w:tcPr>
+          <w:p>
+            <w:pPr>
+              <w:jc w:val="center"/>
+            </w:pPr>
+            <w:r>
+              <w:rPr>
+                <w:rFonts w:ascii="Arial" w:hAnsi="Arial"/>
+                <w:sz w:val="20"/>
+                <w:b/>
+              </w:rPr>
+              <w:t>Factor 1: AI Implementation</w:t>
+            </w:r>
+          </w:p>
+        </w:tc>
+        <w:tc>
+          <w:tcPr>
+            <w:shd w:val="clear" w:color="auto" w:fill="D5E8F0"/>
+          </w:tcPr>
+          <w:p>
+            <w:pPr>
+              <w:jc w:val="center"/>
+            </w:pPr>
+            <w:r>
+              <w:rPr>
+                <w:rFonts w:ascii="Arial" w:hAnsi="Arial"/>
+                <w:sz w:val="20"/>
+                <w:b/>
+              </w:rPr>
+              <w:t>Factor 2: Equity &amp; Community</w:t>
+            </w:r>
+          </w:p>
+        </w:tc>
+        <w:tc>
+          <w:tcPr>
+            <w:shd w:val="clear" w:color="auto" w:fill="D5E8F0"/>
+          </w:tcPr>
+          <w:p>
+            <w:pPr>
+              <w:jc w:val="center"/>
+            </w:pPr>
+            <w:r>
+              <w:rPr>
+                <w:rFonts w:ascii="Arial" w:hAnsi="Arial"/>
+                <w:sz w:val="20"/>
+                <w:b/>
+              </w:rPr>
+              <w:t>h²</w:t>
+            </w:r>
+          </w:p>
+        </w:tc>
+      </w:tr>
+      <w:tr>
+        <w:tc>
+          <w:tcPr/>
+          <w:p>
+            <w:pPr/>
+            <w:r>
+              <w:rPr>
+                <w:rFonts w:ascii="Arial" w:hAnsi="Arial"/>
+                <w:sz w:val="20"/>
+              </w:rPr>
+              <w:t>Data Quality (Q19_1)</w:t>
+            </w:r>
+          </w:p>
+        </w:tc>
+        <w:tc>
+          <w:tcPr>
+            <w:shd w:val="clear" w:color="auto" w:fill="FFFFCC"/>
+          </w:tcPr>
+          <w:p>
+            <w:pPr>
+              <w:jc w:val="center"/>
+            </w:pPr>
+            <w:r>
+              <w:rPr>
+                <w:rFonts w:ascii="Arial" w:hAnsi="Arial"/>
+                <w:sz w:val="20"/>
+              </w:rPr>
+              <w:t>0.603</w:t>
+            </w:r>
+          </w:p>
+        </w:tc>
+        <w:tc>
+          <w:tcPr/>
+          <w:p>
+            <w:pPr>
+              <w:jc w:val="center"/>
+            </w:pPr>
+            <w:r>
+              <w:rPr>
+                <w:rFonts w:ascii="Arial" w:hAnsi="Arial"/>
+                <w:sz w:val="20"/>
+              </w:rPr>
+              <w:t>-0.006</w:t>
+            </w:r>
+          </w:p>
+        </w:tc>
+        <w:tc>
+          <w:tcPr/>
+          <w:p>
+            <w:pPr>
+              <w:jc w:val="center"/>
+            </w:pPr>
+            <w:r>
+              <w:rPr>
+                <w:rFonts w:ascii="Arial" w:hAnsi="Arial"/>
+                <w:sz w:val="20"/>
+              </w:rPr>
+              <w:t>0.364</w:t>
+            </w:r>
+          </w:p>
+        </w:tc>
+      </w:tr>
+      <w:tr>
+        <w:tc>
+          <w:tcPr/>
+          <w:p>
+            <w:pPr/>
+            <w:r>
+              <w:rPr>
+                <w:rFonts w:ascii="Arial" w:hAnsi="Arial"/>
+                <w:sz w:val="20"/>
+              </w:rPr>
+              <w:t>AI Accessibility (Q19_2)</w:t>
+            </w:r>
+          </w:p>
+        </w:tc>
+        <w:tc>
+          <w:tcPr>
+            <w:shd w:val="clear" w:color="auto" w:fill="FFFFCC"/>
+          </w:tcPr>
+          <w:p>
+            <w:pPr>
+              <w:jc w:val="center"/>
+            </w:pPr>
+            <w:r>
+              <w:rPr>
+                <w:rFonts w:ascii="Arial" w:hAnsi="Arial"/>
+                <w:sz w:val="20"/>
+              </w:rPr>
+              <w:t>0.645</w:t>
+            </w:r>
+          </w:p>
+        </w:tc>
+        <w:tc>
+          <w:tcPr/>
+          <w:p>
+            <w:pPr>
+              <w:jc w:val="center"/>
+            </w:pPr>
+            <w:r>
+              <w:rPr>
+                <w:rFonts w:ascii="Arial" w:hAnsi="Arial"/>
+                <w:sz w:val="20"/>
+              </w:rPr>
+              <w:t>0.148</w:t>
+            </w:r>
+          </w:p>
+        </w:tc>
+        <w:tc>
+          <w:tcPr/>
+          <w:p>
+            <w:pPr>
+              <w:jc w:val="center"/>
+            </w:pPr>
+            <w:r>
+              <w:rPr>
+                <w:rFonts w:ascii="Arial" w:hAnsi="Arial"/>
+                <w:sz w:val="20"/>
+              </w:rPr>
+              <w:t>0.438</w:t>
+            </w:r>
+          </w:p>
+        </w:tc>
+      </w:tr>
+      <w:tr>
+        <w:tc>
+          <w:tcPr/>
+          <w:p>
+            <w:pPr/>
+            <w:r>
+              <w:rPr>
+                <w:rFonts w:ascii="Arial" w:hAnsi="Arial"/>
+                <w:sz w:val="20"/>
+              </w:rPr>
+              <w:t>Transparency (Q19_3)</w:t>
+            </w:r>
+          </w:p>
+        </w:tc>
+        <w:tc>
+          <w:tcPr/>
+          <w:p>
+            <w:pPr>
+              <w:jc w:val="center"/>
+            </w:pPr>
+            <w:r>
+              <w:rPr>
+                <w:rFonts w:ascii="Arial" w:hAnsi="Arial"/>
+                <w:sz w:val="20"/>
+              </w:rPr>
+              <w:t>-0.028</w:t>
+            </w:r>
+          </w:p>
+        </w:tc>
+        <w:tc>
+          <w:tcPr>
+            <w:shd w:val="clear" w:color="auto" w:fill="FFFFCC"/>
+          </w:tcPr>
+          <w:p>
+            <w:pPr>
+              <w:jc w:val="center"/>
+            </w:pPr>
+            <w:r>
+              <w:rPr>
+                <w:rFonts w:ascii="Arial" w:hAnsi="Arial"/>
+                <w:sz w:val="20"/>
+              </w:rPr>
+              <w:t>0.495</w:t>
+            </w:r>
+          </w:p>
+        </w:tc>
+        <w:tc>
+          <w:tcPr/>
+          <w:p>
+            <w:pPr>
+              <w:jc w:val="center"/>
+            </w:pPr>
+            <w:r>
+              <w:rPr>
+                <w:rFonts w:ascii="Arial" w:hAnsi="Arial"/>
+                <w:sz w:val="20"/>
+              </w:rPr>
+              <w:t>0.246</w:t>
+            </w:r>
+          </w:p>
+        </w:tc>
+      </w:tr>
+      <w:tr>
+        <w:tc>
+          <w:tcPr/>
+          <w:p>
+            <w:pPr/>
+            <w:r>
+              <w:rPr>
+                <w:rFonts w:ascii="Arial" w:hAnsi="Arial"/>
+                <w:sz w:val="20"/>
+              </w:rPr>
+              <w:t>Ethical Guidelines (Q19_4)</w:t>
+            </w:r>
+          </w:p>
+        </w:tc>
+        <w:tc>
+          <w:tcPr>
+            <w:shd w:val="clear" w:color="auto" w:fill="FFFFCC"/>
+          </w:tcPr>
+          <w:p>
+            <w:pPr>
+              <w:jc w:val="center"/>
+            </w:pPr>
+            <w:r>
+              <w:rPr>
+                <w:rFonts w:ascii="Arial" w:hAnsi="Arial"/>
+                <w:sz w:val="20"/>
+              </w:rPr>
+              <w:t>0.633</w:t>
+            </w:r>
+          </w:p>
+        </w:tc>
+        <w:tc>
+          <w:tcPr/>
+          <w:p>
+            <w:pPr>
+              <w:jc w:val="center"/>
+            </w:pPr>
+            <w:r>
+              <w:rPr>
+                <w:rFonts w:ascii="Arial" w:hAnsi="Arial"/>
+                <w:sz w:val="20"/>
+              </w:rPr>
+              <w:t>0.055</w:t>
+            </w:r>
+          </w:p>
+        </w:tc>
+        <w:tc>
+          <w:tcPr/>
+          <w:p>
+            <w:pPr>
+              <w:jc w:val="center"/>
+            </w:pPr>
+            <w:r>
+              <w:rPr>
+                <w:rFonts w:ascii="Arial" w:hAnsi="Arial"/>
+                <w:sz w:val="20"/>
+              </w:rPr>
+              <w:t>0.404</w:t>
+            </w:r>
+          </w:p>
+        </w:tc>
+      </w:tr>
+      <w:tr>
+        <w:tc>
+          <w:tcPr/>
+          <w:p>
+            <w:pPr/>
+            <w:r>
+              <w:rPr>
+                <w:rFonts w:ascii="Arial" w:hAnsi="Arial"/>
+                <w:sz w:val="20"/>
+              </w:rPr>
+              <w:t>Equitable Resource Dist. (Q19_5)</w:t>
+            </w:r>
+          </w:p>
+        </w:tc>
+        <w:tc>
+          <w:tcPr>
+            <w:shd w:val="clear" w:color="auto" w:fill="FFFFCC"/>
+          </w:tcPr>
+          <w:p>
+            <w:pPr>
+              <w:jc w:val="center"/>
+            </w:pPr>
+            <w:r>
+              <w:rPr>
+                <w:rFonts w:ascii="Arial" w:hAnsi="Arial"/>
+                <w:sz w:val="20"/>
+              </w:rPr>
+              <w:t>0.612</w:t>
+            </w:r>
+          </w:p>
+        </w:tc>
+        <w:tc>
+          <w:tcPr/>
+          <w:p>
+            <w:pPr>
+              <w:jc w:val="center"/>
+            </w:pPr>
+            <w:r>
+              <w:rPr>
+                <w:rFonts w:ascii="Arial" w:hAnsi="Arial"/>
+                <w:sz w:val="20"/>
+              </w:rPr>
+              <w:t>-0.117</w:t>
+            </w:r>
+          </w:p>
+        </w:tc>
+        <w:tc>
+          <w:tcPr/>
+          <w:p>
+            <w:pPr>
+              <w:jc w:val="center"/>
+            </w:pPr>
+            <w:r>
+              <w:rPr>
+                <w:rFonts w:ascii="Arial" w:hAnsi="Arial"/>
+                <w:sz w:val="20"/>
+              </w:rPr>
+              <w:t>0.388</w:t>
+            </w:r>
+          </w:p>
+        </w:tc>
+      </w:tr>
+      <w:tr>
+        <w:tc>
+          <w:tcPr/>
+          <w:p>
+            <w:pPr/>
+            <w:r>
+              <w:rPr>
+                <w:rFonts w:ascii="Arial" w:hAnsi="Arial"/>
+                <w:sz w:val="20"/>
+              </w:rPr>
+              <w:t>Equity in Funding (Q19_6)</w:t>
+            </w:r>
+          </w:p>
+        </w:tc>
+        <w:tc>
+          <w:tcPr/>
+          <w:p>
+            <w:pPr>
+              <w:jc w:val="center"/>
+            </w:pPr>
+            <w:r>
+              <w:rPr>
+                <w:rFonts w:ascii="Arial" w:hAnsi="Arial"/>
+                <w:sz w:val="20"/>
+              </w:rPr>
+              <w:t>0.158</w:t>
+            </w:r>
+          </w:p>
+        </w:tc>
+        <w:tc>
+          <w:tcPr>
+            <w:shd w:val="clear" w:color="auto" w:fill="FFFFCC"/>
+          </w:tcPr>
+          <w:p>
+            <w:pPr>
+              <w:jc w:val="center"/>
+            </w:pPr>
+            <w:r>
+              <w:rPr>
+                <w:rFonts w:ascii="Arial" w:hAnsi="Arial"/>
+                <w:sz w:val="20"/>
+              </w:rPr>
+              <w:t>0.742</w:t>
+            </w:r>
+          </w:p>
+        </w:tc>
+        <w:tc>
+          <w:tcPr/>
+          <w:p>
+            <w:pPr>
+              <w:jc w:val="center"/>
+            </w:pPr>
+            <w:r>
+              <w:rPr>
+                <w:rFonts w:ascii="Arial" w:hAnsi="Arial"/>
+                <w:sz w:val="20"/>
+              </w:rPr>
+              <w:t>0.576</w:t>
+            </w:r>
+          </w:p>
+        </w:tc>
+      </w:tr>
+      <w:tr>
+        <w:tc>
+          <w:tcPr/>
+          <w:p>
+            <w:pPr/>
+            <w:r>
+              <w:rPr>
+                <w:rFonts w:ascii="Arial" w:hAnsi="Arial"/>
+                <w:sz w:val="20"/>
+              </w:rPr>
+              <w:t>AI Literacy Training (Q19_7)</w:t>
+            </w:r>
+          </w:p>
+        </w:tc>
+        <w:tc>
+          <w:tcPr>
+            <w:shd w:val="clear" w:color="auto" w:fill="FFFFCC"/>
+          </w:tcPr>
+          <w:p>
+            <w:pPr>
+              <w:jc w:val="center"/>
+            </w:pPr>
+            <w:r>
+              <w:rPr>
+                <w:rFonts w:ascii="Arial" w:hAnsi="Arial"/>
+                <w:sz w:val="20"/>
+              </w:rPr>
+              <w:t>0.721</w:t>
+            </w:r>
+          </w:p>
+        </w:tc>
+        <w:tc>
+          <w:tcPr/>
+          <w:p>
+            <w:pPr>
+              <w:jc w:val="center"/>
+            </w:pPr>
+            <w:r>
+              <w:rPr>
+                <w:rFonts w:ascii="Arial" w:hAnsi="Arial"/>
+                <w:sz w:val="20"/>
+              </w:rPr>
+              <w:t>0.160</w:t>
+            </w:r>
+          </w:p>
+        </w:tc>
+        <w:tc>
+          <w:tcPr/>
+          <w:p>
+            <w:pPr>
+              <w:jc w:val="center"/>
+            </w:pPr>
+            <w:r>
+              <w:rPr>
+                <w:rFonts w:ascii="Arial" w:hAnsi="Arial"/>
+                <w:sz w:val="20"/>
+              </w:rPr>
+              <w:t>0.546</w:t>
+            </w:r>
+          </w:p>
+        </w:tc>
+      </w:tr>
+      <w:tr>
+        <w:tc>
+          <w:tcPr/>
+          <w:p>
+            <w:pPr/>
+            <w:r>
+              <w:rPr>
+                <w:rFonts w:ascii="Arial" w:hAnsi="Arial"/>
+                <w:sz w:val="20"/>
+              </w:rPr>
+              <w:t>External Resources (Q19_8)</w:t>
+            </w:r>
+          </w:p>
+        </w:tc>
+        <w:tc>
+          <w:tcPr/>
+          <w:p>
+            <w:pPr>
+              <w:jc w:val="center"/>
+            </w:pPr>
+            <w:r>
+              <w:rPr>
+                <w:rFonts w:ascii="Arial" w:hAnsi="Arial"/>
+                <w:sz w:val="20"/>
+              </w:rPr>
+              <w:t>0.015</w:t>
+            </w:r>
+          </w:p>
+        </w:tc>
+        <w:tc>
+          <w:tcPr>
+            <w:shd w:val="clear" w:color="auto" w:fill="FFFFCC"/>
+          </w:tcPr>
+          <w:p>
+            <w:pPr>
+              <w:jc w:val="center"/>
+            </w:pPr>
+            <w:r>
+              <w:rPr>
+                <w:rFonts w:ascii="Arial" w:hAnsi="Arial"/>
+                <w:sz w:val="20"/>
+              </w:rPr>
+              <w:t>0.892</w:t>
+            </w:r>
+          </w:p>
+        </w:tc>
+        <w:tc>
+          <w:tcPr/>
+          <w:p>
+            <w:pPr>
+              <w:jc w:val="center"/>
+            </w:pPr>
+            <w:r>
+              <w:rPr>
+                <w:rFonts w:ascii="Arial" w:hAnsi="Arial"/>
+                <w:sz w:val="20"/>
+              </w:rPr>
+              <w:t>0.796</w:t>
+            </w:r>
+          </w:p>
+        </w:tc>
+      </w:tr>
+      <w:tr>
+        <w:tc>
+          <w:tcPr/>
+          <w:p>
+            <w:pPr/>
+            <w:r>
+              <w:rPr>
+                <w:rFonts w:ascii="Arial" w:hAnsi="Arial"/>
+                <w:sz w:val="20"/>
+              </w:rPr>
+              <w:t>Community Engagement (Q19_9)</w:t>
+            </w:r>
+          </w:p>
+        </w:tc>
+        <w:tc>
+          <w:tcPr/>
+          <w:p>
+            <w:pPr>
+              <w:jc w:val="center"/>
+            </w:pPr>
+            <w:r>
+              <w:rPr>
+                <w:rFonts w:ascii="Arial" w:hAnsi="Arial"/>
+                <w:sz w:val="20"/>
+              </w:rPr>
+              <w:t>-0.009</w:t>
+            </w:r>
+          </w:p>
+        </w:tc>
+        <w:tc>
+          <w:tcPr>
+            <w:shd w:val="clear" w:color="auto" w:fill="FFFFCC"/>
+          </w:tcPr>
+          <w:p>
+            <w:pPr>
+              <w:jc w:val="center"/>
+            </w:pPr>
+            <w:r>
+              <w:rPr>
+                <w:rFonts w:ascii="Arial" w:hAnsi="Arial"/>
+                <w:sz w:val="20"/>
+              </w:rPr>
+              <w:t>0.599</w:t>
+            </w:r>
+          </w:p>
+        </w:tc>
+        <w:tc>
+          <w:tcPr/>
+          <w:p>
+            <w:pPr>
+              <w:jc w:val="center"/>
+            </w:pPr>
+            <w:r>
+              <w:rPr>
+                <w:rFonts w:ascii="Arial" w:hAnsi="Arial"/>
+                <w:sz w:val="20"/>
+              </w:rPr>
+              <w:t>0.359</w:t>
+            </w:r>
+          </w:p>
+        </w:tc>
+      </w:tr>
+      <w:tr>
+        <w:tc>
+          <w:tcPr/>
+          <w:p>
+            <w:pPr/>
+            <w:r>
+              <w:rPr>
+                <w:rFonts w:ascii="Arial" w:hAnsi="Arial"/>
+                <w:sz w:val="20"/>
+              </w:rPr>
+              <w:t>AI Expert Collaboration (Q19_10)</w:t>
+            </w:r>
+          </w:p>
+        </w:tc>
+        <w:tc>
+          <w:tcPr>
+            <w:shd w:val="clear" w:color="auto" w:fill="FFFFCC"/>
+          </w:tcPr>
+          <w:p>
+            <w:pPr>
+              <w:jc w:val="center"/>
+            </w:pPr>
+            <w:r>
+              <w:rPr>
+                <w:rFonts w:ascii="Arial" w:hAnsi="Arial"/>
+                <w:sz w:val="20"/>
+              </w:rPr>
+              <w:t>0.701</w:t>
+            </w:r>
+          </w:p>
+        </w:tc>
+        <w:tc>
+          <w:tcPr/>
+          <w:p>
+            <w:pPr>
+              <w:jc w:val="center"/>
+            </w:pPr>
+            <w:r>
+              <w:rPr>
+                <w:rFonts w:ascii="Arial" w:hAnsi="Arial"/>
+                <w:sz w:val="20"/>
+              </w:rPr>
+              <w:t>-0.044</w:t>
+            </w:r>
+          </w:p>
+        </w:tc>
+        <w:tc>
+          <w:tcPr/>
+          <w:p>
+            <w:pPr>
+              <w:jc w:val="center"/>
+            </w:pPr>
+            <w:r>
+              <w:rPr>
+                <w:rFonts w:ascii="Arial" w:hAnsi="Arial"/>
+                <w:sz w:val="20"/>
+              </w:rPr>
+              <w:t>0.493</w:t>
+            </w:r>
+          </w:p>
+        </w:tc>
+      </w:tr>
+      <w:tr>
+        <w:tc>
+          <w:tcPr>
+            <w:shd w:val="clear" w:color="auto" w:fill="E8E8E8"/>
+          </w:tcPr>
+          <w:p>
+            <w:pPr/>
+            <w:r>
+              <w:rPr>
+                <w:rFonts w:ascii="Arial" w:hAnsi="Arial"/>
+                <w:sz w:val="20"/>
+                <w:b/>
+              </w:rPr>
+              <w:t>SS Loadings</w:t>
+            </w:r>
+          </w:p>
+        </w:tc>
+        <w:tc>
+          <w:tcPr>
+            <w:shd w:val="clear" w:color="auto" w:fill="E8E8E8"/>
+          </w:tcPr>
+          <w:p>
+            <w:pPr>
+              <w:jc w:val="center"/>
+            </w:pPr>
+            <w:r>
+              <w:rPr>
+                <w:rFonts w:ascii="Arial" w:hAnsi="Arial"/>
+                <w:sz w:val="20"/>
+                <w:b/>
+              </w:rPr>
+              <w:t>2.593</w:t>
+            </w:r>
+          </w:p>
+        </w:tc>
+        <w:tc>
+          <w:tcPr>
+            <w:shd w:val="clear" w:color="auto" w:fill="E8E8E8"/>
+          </w:tcPr>
+          <w:p>
+            <w:pPr>
+              <w:jc w:val="center"/>
+            </w:pPr>
+            <w:r>
+              <w:rPr>
+                <w:rFonts w:ascii="Arial" w:hAnsi="Arial"/>
+                <w:sz w:val="20"/>
+                <w:b/>
+              </w:rPr>
+              <w:t>2.016</w:t>
+            </w:r>
+          </w:p>
+        </w:tc>
+        <w:tc>
+          <w:tcPr>
+            <w:shd w:val="clear" w:color="auto" w:fill="E8E8E8"/>
+          </w:tcPr>
+          <w:p>
+            <w:pPr>
+              <w:jc w:val="center"/>
+            </w:pPr>
+            <w:r>
+              <w:rPr>
+                <w:rFonts w:ascii="Arial" w:hAnsi="Arial"/>
+                <w:sz w:val="20"/>
+              </w:rPr>
+              <w:t/>
+            </w:r>
+          </w:p>
+        </w:tc>
+      </w:tr>
+      <w:tr>
+        <w:tc>
+          <w:tcPr>
+            <w:shd w:val="clear" w:color="auto" w:fill="E8E8E8"/>
+          </w:tcPr>
+          <w:p>
+            <w:pPr/>
+            <w:r>
+              <w:rPr>
+                <w:rFonts w:ascii="Arial" w:hAnsi="Arial"/>
+                <w:sz w:val="20"/>
+                <w:b/>
+              </w:rPr>
+              <w:t>% Variance Explained</w:t>
+            </w:r>
+          </w:p>
+        </w:tc>
+        <w:tc>
+          <w:tcPr>
+            <w:shd w:val="clear" w:color="auto" w:fill="E8E8E8"/>
+          </w:tcPr>
+          <w:p>
+            <w:pPr>
+              <w:jc w:val="center"/>
+            </w:pPr>
+            <w:r>
+              <w:rPr>
+                <w:rFonts w:ascii="Arial" w:hAnsi="Arial"/>
+                <w:sz w:val="20"/>
+                <w:b/>
+              </w:rPr>
+              <w:t>25.9%</w:t>
+            </w:r>
+          </w:p>
+        </w:tc>
+        <w:tc>
+          <w:tcPr>
+            <w:shd w:val="clear" w:color="auto" w:fill="E8E8E8"/>
+          </w:tcPr>
+          <w:p>
+            <w:pPr>
+              <w:jc w:val="center"/>
+            </w:pPr>
+            <w:r>
+              <w:rPr>
+                <w:rFonts w:ascii="Arial" w:hAnsi="Arial"/>
+                <w:sz w:val="20"/>
+                <w:b/>
+              </w:rPr>
+              <w:t>20.2%</w:t>
+            </w:r>
+          </w:p>
+        </w:tc>
+        <w:tc>
+          <w:tcPr>
+            <w:shd w:val="clear" w:color="auto" w:fill="E8E8E8"/>
+          </w:tcPr>
+          <w:p>
+            <w:pPr>
+              <w:jc w:val="center"/>
+            </w:pPr>
+            <w:r>
+              <w:rPr>
+                <w:rFonts w:ascii="Arial" w:hAnsi="Arial"/>
+                <w:sz w:val="20"/>
+              </w:rPr>
+              <w:t/>
+            </w:r>
+          </w:p>
+        </w:tc>
+      </w:tr>
+      <w:tr>
+        <w:tc>
+          <w:tcPr>
+            <w:shd w:val="clear" w:color="auto" w:fill="E8E8E8"/>
+          </w:tcPr>
+          <w:p>
+            <w:pPr/>
+            <w:r>
+              <w:rPr>
+                <w:rFonts w:ascii="Arial" w:hAnsi="Arial"/>
+                <w:sz w:val="20"/>
+                <w:b/>
+              </w:rPr>
+              <w:t>Cumulative Variance</w:t>
+            </w:r>
+          </w:p>
+        </w:tc>
+        <w:tc>
+          <w:tcPr>
+            <w:shd w:val="clear" w:color="auto" w:fill="E8E8E8"/>
+          </w:tcPr>
+          <w:p>
+            <w:pPr>
+              <w:jc w:val="center"/>
+            </w:pPr>
+            <w:r>
+              <w:rPr>
+                <w:rFonts w:ascii="Arial" w:hAnsi="Arial"/>
+                <w:sz w:val="20"/>
+                <w:b/>
+              </w:rPr>
+              <w:t>25.9%</w:t>
+            </w:r>
+          </w:p>
+        </w:tc>
+        <w:tc>
+          <w:tcPr>
+            <w:shd w:val="clear" w:color="auto" w:fill="E8E8E8"/>
+          </w:tcPr>
+          <w:p>
+            <w:pPr>
+              <w:jc w:val="center"/>
+            </w:pPr>
+            <w:r>
+              <w:rPr>
+                <w:rFonts w:ascii="Arial" w:hAnsi="Arial"/>
+                <w:sz w:val="20"/>
+                <w:b/>
+              </w:rPr>
+              <w:t>46.1%</w:t>
+            </w:r>
+          </w:p>
+        </w:tc>
+        <w:tc>
+          <w:tcPr>
+            <w:shd w:val="clear" w:color="auto" w:fill="E8E8E8"/>
+          </w:tcPr>
+          <w:p>
+            <w:pPr>
+              <w:jc w:val="center"/>
+            </w:pPr>
+            <w:r>
+              <w:rPr>
+                <w:rFonts w:ascii="Arial" w:hAnsi="Arial"/>
+                <w:sz w:val="20"/>
+              </w:rPr>
+              <w:t/>
+            </w:r>
+          </w:p>
+        </w:tc>
+      </w:tr>
+      <w:tr>
+        <w:tc>
+          <w:tcPr>
+            <w:shd w:val="clear" w:color="auto" w:fill="E8E8E8"/>
+          </w:tcPr>
+          <w:p>
+            <w:pPr/>
+            <w:r>
+              <w:rPr>
+                <w:rFonts w:ascii="Arial" w:hAnsi="Arial"/>
+                <w:sz w:val="20"/>
+                <w:b/>
+              </w:rPr>
+              <w:t>Cronbach’s α</w:t>
+            </w:r>
+          </w:p>
+        </w:tc>
+        <w:tc>
+          <w:tcPr>
+            <w:shd w:val="clear" w:color="auto" w:fill="E8E8E8"/>
+          </w:tcPr>
+          <w:p>
+            <w:pPr>
+              <w:jc w:val="center"/>
+            </w:pPr>
+            <w:r>
+              <w:rPr>
+                <w:rFonts w:ascii="Arial" w:hAnsi="Arial"/>
+                <w:sz w:val="20"/>
+                <w:b/>
+              </w:rPr>
+              <w:t>0.731</w:t>
+            </w:r>
+          </w:p>
+        </w:tc>
+        <w:tc>
+          <w:tcPr>
+            <w:shd w:val="clear" w:color="auto" w:fill="E8E8E8"/>
+          </w:tcPr>
+          <w:p>
+            <w:pPr>
+              <w:jc w:val="center"/>
+            </w:pPr>
+            <w:r>
+              <w:rPr>
+                <w:rFonts w:ascii="Arial" w:hAnsi="Arial"/>
+                <w:sz w:val="20"/>
+                <w:b/>
+              </w:rPr>
+              <w:t>0.651</w:t>
+            </w:r>
+          </w:p>
+        </w:tc>
+        <w:tc>
+          <w:tcPr>
+            <w:shd w:val="clear" w:color="auto" w:fill="E8E8E8"/>
+          </w:tcPr>
+          <w:p>
+            <w:pPr>
+              <w:jc w:val="center"/>
+            </w:pPr>
+            <w:r>
+              <w:rPr>
+                <w:rFonts w:ascii="Arial" w:hAnsi="Arial"/>
+                <w:sz w:val="20"/>
+              </w:rPr>
+              <w:t/>
+            </w:r>
+          </w:p>
+        </w:tc>
+      </w:tr>
+    </w:tbl>
+    <w:p>
+      <w:r>
+        <w:rPr>
+          <w:rFonts w:ascii="Arial" w:hAnsi="Arial"/>
+          <w:i/>
+          <w:sz w:val="18"/>
+        </w:rPr>
+        <w:t>Note. N = 125. Principal axis factoring with Varimax rotation. Factor retention based on parallel analysis (95th percentile criterion, 1,000 Monte Carlo iterations). Yellow-highlighted loadings ≥ |0.40|. KMO = 0.628; Bartlett’s χ² = 270.87, p &lt; .001.</w:t>
+      </w:r>
+    </w:p>
+    <w:p/>
     <w:sectPr>
       <w:pgSz w:w="12240" w:h="15840"/>
       <w:pgMar w:top="1440" w:right="1440" w:bottom="1440" w:left="1440" w:header="720" w:footer="720" w:gutter="0"/>

</xml_diff>